<commit_message>
feat: add CLI commands and experiment modules for Bloom filter analysis refactor: update import paths and remove unused modules docs: improve project documentation and workload evaluation details
</commit_message>
<xml_diff>
--- a/Algo Project Bloom.docx
+++ b/Algo Project Bloom.docx
@@ -448,7 +448,7 @@
           <w:sz w:val="24"/>
           <w:szCs w:val="24"/>
         </w:rPr>
-        <w:t xml:space="preserve"> Test both filters on a simulated web cache or URL filter workload, measuring how many disk or network lookups the filter avoids, and show the deletion support and counter overhead of the counting variant.</w:t>
+        <w:t xml:space="preserve"> Test filters on a simulated web cache or URL filter workload, measuring how many disk or network lookups the filter avoids, and show the deletion support and counter overhead of the counting variant.</w:t>
       </w:r>
     </w:p>
     <w:p>
@@ -826,6 +826,7 @@
     <w:qFormat/>
     <w:pPr>
       <w:widowControl/>
+      <w:suppressAutoHyphens w:val="true"/>
       <w:bidi w:val="0"/>
       <w:spacing w:lineRule="auto" w:line="276" w:before="0" w:after="0"/>
       <w:jc w:val="start"/>
@@ -1008,6 +1009,7 @@
     <w:qFormat/>
     <w:pPr>
       <w:widowControl/>
+      <w:suppressAutoHyphens w:val="true"/>
       <w:bidi w:val="0"/>
       <w:spacing w:lineRule="auto" w:line="276" w:before="0" w:after="0"/>
       <w:jc w:val="start"/>

</xml_diff>